<commit_message>
Use preferred function names in manuscript, documentation and figures
Rename reader-facing references to barbac_cluster(), barbac_extract(),
barbac_extract_stats() and barbac_map(), keeping one note that the
benchmark receipts use super_cluster2(). Add the corrected pipeline figure
and the barcode-design schematic with their generator, re-render Figure 1,
rebuild the manuscript DOCX/PDF, and record the 0.2.2 release verification
receipt in its own dated folder.
</commit_message>
<xml_diff>
--- a/manuscript/barbac_manuscript_publication.docx
+++ b/manuscript/barbac_manuscript_publication.docx
@@ -1038,7 +1038,7 @@
         <w:rPr>
           <w:rStyle w:val="VerbatimChar"/>
         </w:rPr>
-        <w:t xml:space="preserve">run_cli_pipeline()</w:t>
+        <w:t xml:space="preserve">barbac_map()</w:t>
       </w:r>
       <w:r>
         <w:t xml:space="preserve"> </w:t>
@@ -1097,7 +1097,7 @@
         <w:rPr>
           <w:rStyle w:val="VerbatimChar"/>
         </w:rPr>
-        <w:t xml:space="preserve">barbac_xtr()</w:t>
+        <w:t xml:space="preserve">barbac_extract()</w:t>
       </w:r>
       <w:r>
         <w:t xml:space="preserve"> </w:t>
@@ -1136,7 +1136,7 @@
         <w:rPr>
           <w:rStyle w:val="VerbatimChar"/>
         </w:rPr>
-        <w:t xml:space="preserve">barbac_xtr.stats()</w:t>
+        <w:t xml:space="preserve">barbac_extract_stats()</w:t>
       </w:r>
       <w:r>
         <w:t xml:space="preserve">. Study-specific quality filters and UMI deduplication must</w:t>
@@ -1160,7 +1160,7 @@
         <w:rPr>
           <w:rStyle w:val="VerbatimChar"/>
         </w:rPr>
-        <w:t xml:space="preserve">super_cluster2()</w:t>
+        <w:t xml:space="preserve">barbac_cluster()</w:t>
       </w:r>
       <w:r>
         <w:t xml:space="preserve"> </w:t>
@@ -1176,7 +1176,7 @@
       <w:r>
         <w:drawing>
           <wp:inline>
-            <wp:extent cx="5334000" cy="3535925"/>
+            <wp:extent cx="5334000" cy="3535701"/>
             <wp:effectExtent b="0" l="0" r="0" t="0"/>
             <wp:docPr descr="Workflow figure 1" title="" id="23" name="Picture"/>
             <a:graphic>
@@ -1197,7 +1197,7 @@
                   <pic:spPr bwMode="auto">
                     <a:xfrm>
                       <a:off x="0" y="0"/>
-                      <a:ext cx="5334000" cy="3535925"/>
+                      <a:ext cx="5334000" cy="3535701"/>
                     </a:xfrm>
                     <a:prstGeom prst="rect">
                       <a:avLst/>
@@ -1746,13 +1746,34 @@
         <w:rPr>
           <w:rStyle w:val="VerbatimChar"/>
         </w:rPr>
+        <w:t xml:space="preserve">barbac_cluster()</w:t>
+      </w:r>
+      <w:r>
+        <w:t xml:space="preserve"> </w:t>
+      </w:r>
+      <w:r>
+        <w:t xml:space="preserve">(named</w:t>
+      </w:r>
+      <w:r>
+        <w:t xml:space="preserve"> </w:t>
+      </w:r>
+      <w:r>
+        <w:rPr>
+          <w:rStyle w:val="VerbatimChar"/>
+        </w:rPr>
         <w:t xml:space="preserve">super_cluster2()</w:t>
       </w:r>
       <w:r>
         <w:t xml:space="preserve"> </w:t>
       </w:r>
       <w:r>
-        <w:t xml:space="preserve">collapses exact duplicate sequences, processes sequences in</w:t>
+        <w:t xml:space="preserve">in release 0.2.1 and in the</w:t>
+      </w:r>
+      <w:r>
+        <w:t xml:space="preserve"> </w:t>
+      </w:r>
+      <w:r>
+        <w:t xml:space="preserve">benchmark receipts) collapses exact duplicate sequences, processes sequences in</w:t>
       </w:r>
       <w:r>
         <w:t xml:space="preserve"> </w:t>
@@ -2475,25 +2496,31 @@
         <w:pStyle w:val="BodyText"/>
       </w:pPr>
       <w:r>
-        <w:t xml:space="preserve">The 0.2.1 release retains the verified v14 native clustering implementation and</w:t>
-      </w:r>
-      <w:r>
-        <w:t xml:space="preserve"> </w:t>
-      </w:r>
-      <w:r>
-        <w:t xml:space="preserve">adds command-level workflow timings. Lazy loading of BAM-related namespaces reduces</w:t>
-      </w:r>
-      <w:r>
-        <w:t xml:space="preserve"> </w:t>
-      </w:r>
-      <w:r>
-        <w:t xml:space="preserve">startup work for standalone count clustering. Release verification passed 534</w:t>
-      </w:r>
-      <w:r>
-        <w:t xml:space="preserve"> </w:t>
-      </w:r>
-      <w:r>
-        <w:t xml:space="preserve">package assertions in 44 cases and 65 Studio assertions in ten cases, including</w:t>
+        <w:t xml:space="preserve">The 0.2.2 release retains the verified v14 native clustering implementation,</w:t>
+      </w:r>
+      <w:r>
+        <w:t xml:space="preserve"> </w:t>
+      </w:r>
+      <w:r>
+        <w:t xml:space="preserve">adds command-level workflow timings and introduces the preferred public</w:t>
+      </w:r>
+      <w:r>
+        <w:t xml:space="preserve"> </w:t>
+      </w:r>
+      <w:r>
+        <w:t xml:space="preserve">function names used here; the original names remain supported. Lazy loading of BAM-related namespaces reduces</w:t>
+      </w:r>
+      <w:r>
+        <w:t xml:space="preserve"> </w:t>
+      </w:r>
+      <w:r>
+        <w:t xml:space="preserve">startup work for standalone count clustering. Release verification passed 547</w:t>
+      </w:r>
+      <w:r>
+        <w:t xml:space="preserve"> </w:t>
+      </w:r>
+      <w:r>
+        <w:t xml:space="preserve">package assertions in 47 cases and 65 Studio assertions in ten cases, including</w:t>
       </w:r>
       <w:r>
         <w:t xml:space="preserve"> </w:t>

</xml_diff>

<commit_message>
Use the pipeline figure as Figure 1, declare no competing interests, cite 0.2.2
The manuscript PDF build now maps every figures/*.png reference to its
vector PDF. CITATION.cff records version 0.2.2 dated 2026-10-10.
</commit_message>
<xml_diff>
--- a/manuscript/barbac_manuscript_publication.docx
+++ b/manuscript/barbac_manuscript_publication.docx
@@ -1176,14 +1176,14 @@
       <w:r>
         <w:drawing>
           <wp:inline>
-            <wp:extent cx="5334000" cy="3535701"/>
+            <wp:extent cx="5334000" cy="3526186"/>
             <wp:effectExtent b="0" l="0" r="0" t="0"/>
             <wp:docPr descr="Workflow figure 1" title="" id="23" name="Picture"/>
             <a:graphic>
               <a:graphicData uri="http://schemas.openxmlformats.org/drawingml/2006/picture">
                 <pic:pic>
                   <pic:nvPicPr>
-                    <pic:cNvPr descr="figures/workflow.png" id="24" name="Picture"/>
+                    <pic:cNvPr descr="figures/pipeline.png" id="24" name="Picture"/>
                     <pic:cNvPicPr>
                       <a:picLocks noChangeArrowheads="1" noChangeAspect="1"/>
                     </pic:cNvPicPr>
@@ -1197,7 +1197,7 @@
                   <pic:spPr bwMode="auto">
                     <a:xfrm>
                       <a:off x="0" y="0"/>
-                      <a:ext cx="5334000" cy="3535701"/>
+                      <a:ext cx="5334000" cy="3526186"/>
                     </a:xfrm>
                     <a:prstGeom prst="rect">
                       <a:avLst/>
@@ -1231,7 +1231,7 @@
         <w:t xml:space="preserve"> </w:t>
       </w:r>
       <w:r>
-        <w:t xml:space="preserve">The Barbac workflow. R1-only reads map directly; overlapping paired reads merge with PEAR. Extracted barcodes or independent count tables enter the same native clustering engine. Shared memberships support sample counts, statistics and lineage-frequency plots.</w:t>
+        <w:t xml:space="preserve">The barbac pipeline. Illumina reads, either R1-only or overlapping pairs, pass quality control, optional merging, mapping and barcode extraction; extracted counts or an independent count table enter the native clustering engine; clusters feed statistics and lineage-frequency plots. Icons show the file type written at each stage.</w:t>
       </w:r>
     </w:p>
     <w:bookmarkEnd w:id="25"/>
@@ -5786,7 +5786,7 @@
         <w:pStyle w:val="FirstParagraph"/>
       </w:pPr>
       <w:r>
-        <w:t xml:space="preserve">[Author completion required.]</w:t>
+        <w:t xml:space="preserve">The authors declare no competing interests.</w:t>
       </w:r>
     </w:p>
     <w:bookmarkEnd w:id="46"/>

</xml_diff>

<commit_message>
Disclose substitution-only development designs and assemble the supplement
Methods 2.2 states that substitution-only variants of both designs were
examined during development and reports them as Table S3. A new
build_supplement.py assembles Supplementary Methods (Table S1), the Chen
2023 application (Table S2, Figure S1) and the v14 development reference
(Table S3) into supplementary_information.pdf.
</commit_message>
<xml_diff>
--- a/manuscript/barbac_manuscript_publication.docx
+++ b/manuscript/barbac_manuscript_publication.docx
@@ -218,13 +218,19 @@
         <w:t xml:space="preserve"> </w:t>
       </w:r>
       <w:r>
-        <w:t xml:space="preserve">Benchmark methods, statistical comparisons,</w:t>
-      </w:r>
-      <w:r>
-        <w:t xml:space="preserve"> </w:t>
-      </w:r>
-      <w:r>
-        <w:t xml:space="preserve">execution records and application analyses accompany this manuscript.</w:t>
+        <w:t xml:space="preserve">Supplementary Methods and Tables S1–S3</w:t>
+      </w:r>
+      <w:r>
+        <w:t xml:space="preserve"> </w:t>
+      </w:r>
+      <w:r>
+        <w:t xml:space="preserve">(benchmark settings, paired comparisons, the Chen et al. (2023) application</w:t>
+      </w:r>
+      <w:r>
+        <w:t xml:space="preserve"> </w:t>
+      </w:r>
+      <w:r>
+        <w:t xml:space="preserve">and the development reference) accompany this manuscript.</w:t>
       </w:r>
     </w:p>
     <w:bookmarkStart w:id="21" w:name="introduction"/>
@@ -1372,6 +1378,30 @@
       </w:r>
       <w:r>
         <w:t xml:space="preserve">model all dinucleotide, PCR-family or synthesis effects.</w:t>
+      </w:r>
+      <w:r>
+        <w:t xml:space="preserve"> </w:t>
+      </w:r>
+      <w:r>
+        <w:t xml:space="preserve">Substitution-only variants of both designs were examined during development</w:t>
+      </w:r>
+      <w:r>
+        <w:t xml:space="preserve"> </w:t>
+      </w:r>
+      <w:r>
+        <w:t xml:space="preserve">and are reported in Supplementary Table S3; the main comparison uses the</w:t>
+      </w:r>
+      <w:r>
+        <w:t xml:space="preserve"> </w:t>
+      </w:r>
+      <w:r>
+        <w:t xml:space="preserve">indel-containing designs because repeat-dependent indels are characteristic</w:t>
+      </w:r>
+      <w:r>
+        <w:t xml:space="preserve"> </w:t>
+      </w:r>
+      <w:r>
+        <w:t xml:space="preserve">of barcode libraries.</w:t>
       </w:r>
     </w:p>
     <w:p>

</xml_diff>